<commit_message>
feat(report): finish 1st part of report
</commit_message>
<xml_diff>
--- a/docs/3_Бибиков_Максим_Алексеевич.docx
+++ b/docs/3_Бибиков_Максим_Алексеевич.docx
@@ -1957,6 +1957,7 @@
         <w:rPr>
           <w:sz w:val="28"/>
           <w:szCs w:val="28"/>
+          <w:lang w:val="en-US"/>
         </w:rPr>
       </w:pPr>
       <w:bookmarkStart w:id="8" w:name="_Toc223355069"/>
@@ -2010,13 +2011,6 @@
         <w:spacing w:line="240" w:lineRule="auto"/>
         <w:ind w:firstLine="708"/>
         <w:jc w:val="left"/>
-        <w:rPr>
-          <w:rFonts w:ascii="Times New Roman" w:eastAsia="Times New Roman" w:hAnsi="Times New Roman" w:cs="Times New Roman"/>
-          <w:b/>
-          <w:color w:val="000000"/>
-          <w:sz w:val="28"/>
-          <w:szCs w:val="28"/>
-        </w:rPr>
       </w:pPr>
       <w:hyperlink w:anchor="_2et92p0">
         <w:bookmarkStart w:id="10" w:name="_Toc223355070"/>
@@ -2072,17 +2066,882 @@
           <w:tab w:val="right" w:pos="9344"/>
         </w:tabs>
         <w:spacing w:line="240" w:lineRule="auto"/>
+        <w:ind w:firstLine="0"/>
+        <w:jc w:val="left"/>
+        <w:rPr>
+          <w:lang w:val="en-US"/>
+        </w:rPr>
+      </w:pPr>
+    </w:p>
+    <w:p>
+      <w:pPr>
+        <w:widowControl/>
+        <w:tabs>
+          <w:tab w:val="right" w:pos="9344"/>
+        </w:tabs>
+        <w:spacing w:line="240" w:lineRule="auto"/>
         <w:ind w:firstLine="708"/>
         <w:jc w:val="left"/>
         <w:rPr>
-          <w:b/>
-        </w:rPr>
-      </w:pPr>
-      <w:r>
-        <w:rPr>
-          <w:b/>
-        </w:rPr>
-        <w:tab/>
+          <w:lang w:val="ru-BY"/>
+        </w:rPr>
+      </w:pPr>
+      <w:r>
+        <w:rPr>
+          <w:lang w:val="ru-BY"/>
+        </w:rPr>
+        <w:t>Yahoo Finance</w:t>
+      </w:r>
+      <w:r>
+        <w:rPr>
+          <w:lang w:val="ru-BY"/>
+        </w:rPr>
+        <w:t xml:space="preserve"> –</w:t>
+      </w:r>
+      <w:r>
+        <w:rPr>
+          <w:lang w:val="ru-BY"/>
+        </w:rPr>
+        <w:t xml:space="preserve"> </w:t>
+      </w:r>
+      <w:r>
+        <w:t xml:space="preserve">одно </w:t>
+      </w:r>
+      <w:r>
+        <w:rPr>
+          <w:lang w:val="ru-BY"/>
+        </w:rPr>
+        <w:t>из старейших финансовых приложений, доступное в вебе и на мобильных устройствах. Позволяет отслеживать акции, ETF, валюты и ограниченный набор криптовалют. Ключевая функция – создание персонального портфеля с расчётом прибыли/убытка. Достоинства: удобный интерфейс с интерактивными графиками, персонализированные новости по каждой бумаге, настраиваемые оповещения, синхронизация между устройствами. Недостатки: отсутствие поддержки Steam-предметов, ограниченная поддержка криптовалют, периодические ошибки в данных портфеля.</w:t>
+      </w:r>
+    </w:p>
+    <w:p>
+      <w:pPr>
+        <w:widowControl/>
+        <w:tabs>
+          <w:tab w:val="right" w:pos="9344"/>
+        </w:tabs>
+        <w:spacing w:line="240" w:lineRule="auto"/>
+        <w:ind w:firstLine="708"/>
+        <w:jc w:val="left"/>
+        <w:rPr>
+          <w:lang w:val="ru-BY"/>
+        </w:rPr>
+      </w:pPr>
+    </w:p>
+    <w:p>
+      <w:pPr>
+        <w:widowControl/>
+        <w:tabs>
+          <w:tab w:val="right" w:pos="9344"/>
+        </w:tabs>
+        <w:spacing w:line="240" w:lineRule="auto"/>
+        <w:ind w:firstLine="708"/>
+        <w:jc w:val="left"/>
+        <w:rPr>
+          <w:lang w:val="en-US"/>
+        </w:rPr>
+      </w:pPr>
+      <w:r>
+        <w:rPr>
+          <w:lang w:val="en-US"/>
+        </w:rPr>
+        <w:drawing>
+          <wp:inline distT="0" distB="0" distL="0" distR="0" wp14:anchorId="78EBC5B3" wp14:editId="340F771C">
+            <wp:extent cx="5217096" cy="2805430"/>
+            <wp:effectExtent l="0" t="0" r="3175" b="0"/>
+            <wp:docPr id="1016396107" name="Picture 1"/>
+            <wp:cNvGraphicFramePr>
+              <a:graphicFrameLocks xmlns:a="http://schemas.openxmlformats.org/drawingml/2006/main" noChangeAspect="1"/>
+            </wp:cNvGraphicFramePr>
+            <a:graphic xmlns:a="http://schemas.openxmlformats.org/drawingml/2006/main">
+              <a:graphicData uri="http://schemas.openxmlformats.org/drawingml/2006/picture">
+                <pic:pic xmlns:pic="http://schemas.openxmlformats.org/drawingml/2006/picture">
+                  <pic:nvPicPr>
+                    <pic:cNvPr id="1016396107" name=""/>
+                    <pic:cNvPicPr/>
+                  </pic:nvPicPr>
+                  <pic:blipFill>
+                    <a:blip r:embed="rId9"/>
+                    <a:stretch>
+                      <a:fillRect/>
+                    </a:stretch>
+                  </pic:blipFill>
+                  <pic:spPr>
+                    <a:xfrm>
+                      <a:off x="0" y="0"/>
+                      <a:ext cx="5225972" cy="2810203"/>
+                    </a:xfrm>
+                    <a:prstGeom prst="rect">
+                      <a:avLst/>
+                    </a:prstGeom>
+                  </pic:spPr>
+                </pic:pic>
+              </a:graphicData>
+            </a:graphic>
+          </wp:inline>
+        </w:drawing>
+      </w:r>
+    </w:p>
+    <w:p>
+      <w:pPr>
+        <w:widowControl/>
+        <w:tabs>
+          <w:tab w:val="right" w:pos="9344"/>
+        </w:tabs>
+        <w:spacing w:line="240" w:lineRule="auto"/>
+        <w:ind w:firstLine="708"/>
+        <w:jc w:val="left"/>
+        <w:rPr>
+          <w:lang w:val="ru-BY"/>
+        </w:rPr>
+      </w:pPr>
+    </w:p>
+    <w:p>
+      <w:pPr>
+        <w:widowControl/>
+        <w:tabs>
+          <w:tab w:val="right" w:pos="9344"/>
+        </w:tabs>
+        <w:spacing w:line="240" w:lineRule="auto"/>
+        <w:ind w:firstLine="708"/>
+        <w:jc w:val="center"/>
+        <w:rPr>
+          <w:lang w:val="ru-BY"/>
+        </w:rPr>
+      </w:pPr>
+      <w:r>
+        <w:rPr>
+          <w:lang w:val="ru-BY"/>
+        </w:rPr>
+        <w:t xml:space="preserve">Рисунок 1.1 – Интерфейс </w:t>
+      </w:r>
+      <w:r>
+        <w:t>сайта</w:t>
+      </w:r>
+      <w:r>
+        <w:rPr>
+          <w:lang w:val="ru-BY"/>
+        </w:rPr>
+        <w:t xml:space="preserve"> Yahoo Finance</w:t>
+      </w:r>
+    </w:p>
+    <w:p>
+      <w:pPr>
+        <w:widowControl/>
+        <w:tabs>
+          <w:tab w:val="right" w:pos="9344"/>
+        </w:tabs>
+        <w:spacing w:line="240" w:lineRule="auto"/>
+        <w:ind w:firstLine="708"/>
+        <w:jc w:val="left"/>
+        <w:rPr>
+          <w:lang w:val="ru-BY"/>
+        </w:rPr>
+      </w:pPr>
+    </w:p>
+    <w:p>
+      <w:pPr>
+        <w:widowControl/>
+        <w:tabs>
+          <w:tab w:val="right" w:pos="9344"/>
+        </w:tabs>
+        <w:spacing w:line="240" w:lineRule="auto"/>
+        <w:ind w:firstLine="708"/>
+        <w:jc w:val="left"/>
+        <w:rPr>
+          <w:lang w:val="ru-BY"/>
+        </w:rPr>
+      </w:pPr>
+      <w:r>
+        <w:rPr>
+          <w:lang w:val="ru-BY"/>
+        </w:rPr>
+        <w:t>CoinMarketCap</w:t>
+      </w:r>
+      <w:r>
+        <w:rPr>
+          <w:lang w:val="ru-BY"/>
+        </w:rPr>
+        <w:t xml:space="preserve"> </w:t>
+      </w:r>
+      <w:r>
+        <w:rPr>
+          <w:lang w:val="ru-BY"/>
+        </w:rPr>
+        <w:t xml:space="preserve">– </w:t>
+      </w:r>
+      <w:r>
+        <w:rPr>
+          <w:lang w:val="ru-BY"/>
+        </w:rPr>
+        <w:t>в</w:t>
+      </w:r>
+      <w:r>
+        <w:rPr>
+          <w:lang w:val="ru-BY"/>
+        </w:rPr>
+        <w:t>едущая платформа для отслеживания криптовалют, агрегирующая данные с сотен бирж. Предоставляет информацию о более чем 21 000 цифровых активов: цены, капитализация, объёмы торгов, исторические графики. Позволяет создавать криптовалютный портфель с отслеживанием доходности. Достоинства: наиболее полная база криптоактивов, авторитетность данных, наличие API для разработчиков. Недостатки: узкая специализация (нет акций и Steam).</w:t>
+      </w:r>
+    </w:p>
+    <w:p>
+      <w:pPr>
+        <w:widowControl/>
+        <w:tabs>
+          <w:tab w:val="right" w:pos="9344"/>
+        </w:tabs>
+        <w:spacing w:line="240" w:lineRule="auto"/>
+        <w:ind w:firstLine="708"/>
+        <w:jc w:val="left"/>
+        <w:rPr>
+          <w:lang w:val="ru-BY"/>
+        </w:rPr>
+      </w:pPr>
+    </w:p>
+    <w:p>
+      <w:pPr>
+        <w:widowControl/>
+        <w:tabs>
+          <w:tab w:val="right" w:pos="9344"/>
+        </w:tabs>
+        <w:spacing w:line="240" w:lineRule="auto"/>
+        <w:ind w:firstLine="708"/>
+        <w:jc w:val="left"/>
+        <w:rPr>
+          <w:lang w:val="ru-BY"/>
+        </w:rPr>
+      </w:pPr>
+      <w:r>
+        <w:rPr>
+          <w:lang w:val="ru-BY"/>
+        </w:rPr>
+        <w:lastRenderedPageBreak/>
+        <w:drawing>
+          <wp:inline distT="0" distB="0" distL="0" distR="0" wp14:anchorId="6FC2D587" wp14:editId="0F8B0028">
+            <wp:extent cx="5188585" cy="2790098"/>
+            <wp:effectExtent l="0" t="0" r="0" b="0"/>
+            <wp:docPr id="118566524" name="Picture 1"/>
+            <wp:cNvGraphicFramePr>
+              <a:graphicFrameLocks xmlns:a="http://schemas.openxmlformats.org/drawingml/2006/main" noChangeAspect="1"/>
+            </wp:cNvGraphicFramePr>
+            <a:graphic xmlns:a="http://schemas.openxmlformats.org/drawingml/2006/main">
+              <a:graphicData uri="http://schemas.openxmlformats.org/drawingml/2006/picture">
+                <pic:pic xmlns:pic="http://schemas.openxmlformats.org/drawingml/2006/picture">
+                  <pic:nvPicPr>
+                    <pic:cNvPr id="118566524" name=""/>
+                    <pic:cNvPicPr/>
+                  </pic:nvPicPr>
+                  <pic:blipFill>
+                    <a:blip r:embed="rId10"/>
+                    <a:stretch>
+                      <a:fillRect/>
+                    </a:stretch>
+                  </pic:blipFill>
+                  <pic:spPr>
+                    <a:xfrm>
+                      <a:off x="0" y="0"/>
+                      <a:ext cx="5203160" cy="2797936"/>
+                    </a:xfrm>
+                    <a:prstGeom prst="rect">
+                      <a:avLst/>
+                    </a:prstGeom>
+                  </pic:spPr>
+                </pic:pic>
+              </a:graphicData>
+            </a:graphic>
+          </wp:inline>
+        </w:drawing>
+      </w:r>
+    </w:p>
+    <w:p>
+      <w:pPr>
+        <w:widowControl/>
+        <w:tabs>
+          <w:tab w:val="right" w:pos="9344"/>
+        </w:tabs>
+        <w:spacing w:line="240" w:lineRule="auto"/>
+        <w:ind w:firstLine="708"/>
+        <w:jc w:val="left"/>
+        <w:rPr>
+          <w:lang w:val="ru-BY"/>
+        </w:rPr>
+      </w:pPr>
+    </w:p>
+    <w:p>
+      <w:pPr>
+        <w:widowControl/>
+        <w:tabs>
+          <w:tab w:val="right" w:pos="9344"/>
+        </w:tabs>
+        <w:spacing w:line="240" w:lineRule="auto"/>
+        <w:ind w:firstLine="708"/>
+        <w:jc w:val="center"/>
+        <w:rPr>
+          <w:lang w:val="ru-BY"/>
+        </w:rPr>
+      </w:pPr>
+      <w:r>
+        <w:rPr>
+          <w:lang w:val="ru-BY"/>
+        </w:rPr>
+        <w:t xml:space="preserve">Рисунок 1.2 – </w:t>
+      </w:r>
+      <w:r>
+        <w:rPr>
+          <w:lang w:val="ru-BY"/>
+        </w:rPr>
+        <w:t>Главная странциа</w:t>
+      </w:r>
+      <w:r>
+        <w:rPr>
+          <w:lang w:val="ru-BY"/>
+        </w:rPr>
+        <w:t xml:space="preserve"> CoinMarketCap</w:t>
+      </w:r>
+    </w:p>
+    <w:p>
+      <w:pPr>
+        <w:widowControl/>
+        <w:tabs>
+          <w:tab w:val="right" w:pos="9344"/>
+        </w:tabs>
+        <w:spacing w:line="240" w:lineRule="auto"/>
+        <w:ind w:firstLine="708"/>
+        <w:jc w:val="center"/>
+        <w:rPr>
+          <w:lang w:val="ru-BY"/>
+        </w:rPr>
+      </w:pPr>
+    </w:p>
+    <w:p>
+      <w:pPr>
+        <w:widowControl/>
+        <w:tabs>
+          <w:tab w:val="right" w:pos="9344"/>
+        </w:tabs>
+        <w:spacing w:line="240" w:lineRule="auto"/>
+        <w:ind w:firstLine="708"/>
+        <w:jc w:val="left"/>
+        <w:rPr>
+          <w:lang w:val="ru-BY"/>
+        </w:rPr>
+      </w:pPr>
+      <w:r>
+        <w:rPr>
+          <w:lang w:val="ru-BY"/>
+        </w:rPr>
+        <w:t>Delta (eToro)</w:t>
+      </w:r>
+      <w:r>
+        <w:rPr>
+          <w:lang w:val="ru-BY"/>
+        </w:rPr>
+        <w:t xml:space="preserve"> </w:t>
+      </w:r>
+      <w:r>
+        <w:rPr>
+          <w:lang w:val="ru-BY"/>
+        </w:rPr>
+        <w:t xml:space="preserve">– </w:t>
+      </w:r>
+      <w:r>
+        <w:rPr>
+          <w:lang w:val="ru-BY"/>
+        </w:rPr>
+        <w:t>м</w:t>
+      </w:r>
+      <w:r>
+        <w:rPr>
+          <w:lang w:val="ru-BY"/>
+        </w:rPr>
+        <w:t>ощный инвестиционный трекер, поддерживающий тысячи криптовалют, акции и ETF с крупнейших бирж. Предлагает автоматическую синхронизацию с биржами и кошельками. Ключевое преимущество – глубокая аналитика портфеля: диаграммы диверсификации, графики производительности, сравнение с индексами. Достоинства: широкий охват активов, удобный мобильный интерфейс, детальная статистика. Недостатки: отсутствие Steam-предметов, расширенная аналитика только в платной версии.</w:t>
+      </w:r>
+    </w:p>
+    <w:p>
+      <w:pPr>
+        <w:widowControl/>
+        <w:tabs>
+          <w:tab w:val="right" w:pos="9344"/>
+        </w:tabs>
+        <w:spacing w:line="240" w:lineRule="auto"/>
+        <w:ind w:firstLine="708"/>
+        <w:jc w:val="left"/>
+        <w:rPr>
+          <w:lang w:val="ru-BY"/>
+        </w:rPr>
+      </w:pPr>
+      <w:r>
+        <w:rPr>
+          <w:noProof/>
+        </w:rPr>
+        <w:drawing>
+          <wp:anchor distT="0" distB="0" distL="114300" distR="114300" simplePos="0" relativeHeight="251658240" behindDoc="1" locked="0" layoutInCell="1" allowOverlap="1" wp14:anchorId="68794A63" wp14:editId="2E6F6C90">
+            <wp:simplePos x="0" y="0"/>
+            <wp:positionH relativeFrom="column">
+              <wp:posOffset>2150745</wp:posOffset>
+            </wp:positionH>
+            <wp:positionV relativeFrom="paragraph">
+              <wp:posOffset>207645</wp:posOffset>
+            </wp:positionV>
+            <wp:extent cx="1586230" cy="3223260"/>
+            <wp:effectExtent l="0" t="0" r="0" b="0"/>
+            <wp:wrapTopAndBottom/>
+            <wp:docPr id="370743938" name="Picture 1"/>
+            <wp:cNvGraphicFramePr>
+              <a:graphicFrameLocks xmlns:a="http://schemas.openxmlformats.org/drawingml/2006/main" noChangeAspect="1"/>
+            </wp:cNvGraphicFramePr>
+            <a:graphic xmlns:a="http://schemas.openxmlformats.org/drawingml/2006/main">
+              <a:graphicData uri="http://schemas.openxmlformats.org/drawingml/2006/picture">
+                <pic:pic xmlns:pic="http://schemas.openxmlformats.org/drawingml/2006/picture">
+                  <pic:nvPicPr>
+                    <pic:cNvPr id="0" name="Picture 1"/>
+                    <pic:cNvPicPr>
+                      <a:picLocks noChangeAspect="1" noChangeArrowheads="1"/>
+                    </pic:cNvPicPr>
+                  </pic:nvPicPr>
+                  <pic:blipFill>
+                    <a:blip r:embed="rId11" cstate="print">
+                      <a:extLst>
+                        <a:ext uri="{28A0092B-C50C-407E-A947-70E740481C1C}">
+                          <a14:useLocalDpi xmlns:a14="http://schemas.microsoft.com/office/drawing/2010/main" val="0"/>
+                        </a:ext>
+                      </a:extLst>
+                    </a:blip>
+                    <a:srcRect/>
+                    <a:stretch>
+                      <a:fillRect/>
+                    </a:stretch>
+                  </pic:blipFill>
+                  <pic:spPr bwMode="auto">
+                    <a:xfrm>
+                      <a:off x="0" y="0"/>
+                      <a:ext cx="1586230" cy="3223260"/>
+                    </a:xfrm>
+                    <a:prstGeom prst="rect">
+                      <a:avLst/>
+                    </a:prstGeom>
+                    <a:noFill/>
+                    <a:ln>
+                      <a:noFill/>
+                    </a:ln>
+                  </pic:spPr>
+                </pic:pic>
+              </a:graphicData>
+            </a:graphic>
+            <wp14:sizeRelH relativeFrom="margin">
+              <wp14:pctWidth>0</wp14:pctWidth>
+            </wp14:sizeRelH>
+            <wp14:sizeRelV relativeFrom="margin">
+              <wp14:pctHeight>0</wp14:pctHeight>
+            </wp14:sizeRelV>
+          </wp:anchor>
+        </w:drawing>
+      </w:r>
+    </w:p>
+    <w:p>
+      <w:pPr>
+        <w:widowControl/>
+        <w:tabs>
+          <w:tab w:val="right" w:pos="9344"/>
+        </w:tabs>
+        <w:spacing w:line="240" w:lineRule="auto"/>
+        <w:ind w:firstLine="708"/>
+        <w:jc w:val="left"/>
+        <w:rPr>
+          <w:lang w:val="ru-BY"/>
+        </w:rPr>
+      </w:pPr>
+    </w:p>
+    <w:p>
+      <w:pPr>
+        <w:widowControl/>
+        <w:tabs>
+          <w:tab w:val="right" w:pos="9344"/>
+        </w:tabs>
+        <w:spacing w:line="240" w:lineRule="auto"/>
+        <w:ind w:firstLine="708"/>
+        <w:jc w:val="center"/>
+        <w:rPr>
+          <w:lang w:val="ru-BY"/>
+        </w:rPr>
+      </w:pPr>
+      <w:r>
+        <w:rPr>
+          <w:lang w:val="ru-BY"/>
+        </w:rPr>
+        <w:t xml:space="preserve">Рисунок 1.3 – </w:t>
+      </w:r>
+      <w:r>
+        <w:rPr>
+          <w:lang w:val="ru-BY"/>
+        </w:rPr>
+        <w:t>Мобильное приложение</w:t>
+      </w:r>
+      <w:r>
+        <w:rPr>
+          <w:lang w:val="ru-BY"/>
+        </w:rPr>
+        <w:t xml:space="preserve"> Delta</w:t>
+      </w:r>
+    </w:p>
+    <w:p>
+      <w:pPr>
+        <w:widowControl/>
+        <w:tabs>
+          <w:tab w:val="right" w:pos="9344"/>
+        </w:tabs>
+        <w:spacing w:line="240" w:lineRule="auto"/>
+        <w:ind w:firstLine="708"/>
+        <w:jc w:val="left"/>
+        <w:rPr>
+          <w:lang w:val="ru-BY"/>
+        </w:rPr>
+      </w:pPr>
+      <w:r>
+        <w:rPr>
+          <w:lang w:val="ru-BY"/>
+        </w:rPr>
+        <w:lastRenderedPageBreak/>
+        <w:t>Pricempire</w:t>
+      </w:r>
+      <w:r>
+        <w:rPr>
+          <w:lang w:val="ru-BY"/>
+        </w:rPr>
+        <w:t xml:space="preserve"> </w:t>
+      </w:r>
+      <w:r>
+        <w:rPr>
+          <w:lang w:val="ru-BY"/>
+        </w:rPr>
+        <w:t>–</w:t>
+      </w:r>
+      <w:r>
+        <w:rPr>
+          <w:lang w:val="ru-BY"/>
+        </w:rPr>
+        <w:t xml:space="preserve"> с</w:t>
+      </w:r>
+      <w:r>
+        <w:rPr>
+          <w:lang w:val="ru-BY"/>
+        </w:rPr>
+        <w:t>пециализированная платформа для трейдеров игровыми предметами (CS2, Dota 2, Rust). Агрегирует цены с 40+ маркетплейсов, позволяет создавать портфель инвентаря с расчётом прибыли, отслеживать исторические графики, устанавливать оповещения и пользоваться API. Достоинства: глубокая аналитика рынка скинов, поддержка различных торговых стратегий. Недостатки: только игровые предметы, платные подписки для расширенного функционала</w:t>
+      </w:r>
+      <w:r>
+        <w:rPr>
+          <w:lang w:val="ru-BY"/>
+        </w:rPr>
+        <w:t xml:space="preserve">, </w:t>
+      </w:r>
+      <w:r>
+        <w:t>медленная работа сайта, перегруженный интерфейс</w:t>
+      </w:r>
+      <w:r>
+        <w:rPr>
+          <w:lang w:val="ru-BY"/>
+        </w:rPr>
+        <w:t>.</w:t>
+      </w:r>
+    </w:p>
+    <w:p>
+      <w:pPr>
+        <w:widowControl/>
+        <w:tabs>
+          <w:tab w:val="right" w:pos="9344"/>
+        </w:tabs>
+        <w:spacing w:line="240" w:lineRule="auto"/>
+        <w:ind w:firstLine="708"/>
+        <w:jc w:val="left"/>
+        <w:rPr>
+          <w:lang w:val="ru-BY"/>
+        </w:rPr>
+      </w:pPr>
+    </w:p>
+    <w:p>
+      <w:pPr>
+        <w:widowControl/>
+        <w:tabs>
+          <w:tab w:val="right" w:pos="9344"/>
+        </w:tabs>
+        <w:spacing w:line="240" w:lineRule="auto"/>
+        <w:ind w:firstLine="708"/>
+        <w:jc w:val="left"/>
+        <w:rPr>
+          <w:lang w:val="ru-BY"/>
+        </w:rPr>
+      </w:pPr>
+      <w:r>
+        <w:rPr>
+          <w:lang w:val="ru-BY"/>
+        </w:rPr>
+        <w:drawing>
+          <wp:inline distT="0" distB="0" distL="0" distR="0" wp14:anchorId="67EE1ED6" wp14:editId="384AE9A0">
+            <wp:extent cx="5334000" cy="2865443"/>
+            <wp:effectExtent l="0" t="0" r="0" b="0"/>
+            <wp:docPr id="83249049" name="Picture 1"/>
+            <wp:cNvGraphicFramePr>
+              <a:graphicFrameLocks xmlns:a="http://schemas.openxmlformats.org/drawingml/2006/main" noChangeAspect="1"/>
+            </wp:cNvGraphicFramePr>
+            <a:graphic xmlns:a="http://schemas.openxmlformats.org/drawingml/2006/main">
+              <a:graphicData uri="http://schemas.openxmlformats.org/drawingml/2006/picture">
+                <pic:pic xmlns:pic="http://schemas.openxmlformats.org/drawingml/2006/picture">
+                  <pic:nvPicPr>
+                    <pic:cNvPr id="83249049" name=""/>
+                    <pic:cNvPicPr/>
+                  </pic:nvPicPr>
+                  <pic:blipFill>
+                    <a:blip r:embed="rId12"/>
+                    <a:stretch>
+                      <a:fillRect/>
+                    </a:stretch>
+                  </pic:blipFill>
+                  <pic:spPr>
+                    <a:xfrm>
+                      <a:off x="0" y="0"/>
+                      <a:ext cx="5338401" cy="2867807"/>
+                    </a:xfrm>
+                    <a:prstGeom prst="rect">
+                      <a:avLst/>
+                    </a:prstGeom>
+                  </pic:spPr>
+                </pic:pic>
+              </a:graphicData>
+            </a:graphic>
+          </wp:inline>
+        </w:drawing>
+      </w:r>
+    </w:p>
+    <w:p>
+      <w:pPr>
+        <w:widowControl/>
+        <w:tabs>
+          <w:tab w:val="right" w:pos="9344"/>
+        </w:tabs>
+        <w:spacing w:line="240" w:lineRule="auto"/>
+        <w:ind w:firstLine="708"/>
+        <w:jc w:val="left"/>
+        <w:rPr>
+          <w:lang w:val="en-US"/>
+        </w:rPr>
+      </w:pPr>
+    </w:p>
+    <w:p>
+      <w:pPr>
+        <w:widowControl/>
+        <w:tabs>
+          <w:tab w:val="right" w:pos="9344"/>
+        </w:tabs>
+        <w:spacing w:line="240" w:lineRule="auto"/>
+        <w:ind w:firstLine="708"/>
+        <w:jc w:val="center"/>
+        <w:rPr>
+          <w:lang w:val="ru-BY"/>
+        </w:rPr>
+      </w:pPr>
+      <w:r>
+        <w:rPr>
+          <w:lang w:val="ru-BY"/>
+        </w:rPr>
+        <w:t>Рисунок 1.4 –</w:t>
+      </w:r>
+      <w:r>
+        <w:rPr>
+          <w:lang w:val="ru-BY"/>
+        </w:rPr>
+        <w:t xml:space="preserve"> Страница портфеля </w:t>
+      </w:r>
+      <w:r>
+        <w:t>в</w:t>
+      </w:r>
+      <w:r>
+        <w:rPr>
+          <w:lang w:val="ru-BY"/>
+        </w:rPr>
+        <w:t xml:space="preserve"> Pricempire</w:t>
+      </w:r>
+    </w:p>
+    <w:p>
+      <w:pPr>
+        <w:widowControl/>
+        <w:tabs>
+          <w:tab w:val="right" w:pos="9344"/>
+        </w:tabs>
+        <w:spacing w:line="240" w:lineRule="auto"/>
+        <w:ind w:firstLine="708"/>
+        <w:jc w:val="center"/>
+        <w:rPr>
+          <w:lang w:val="ru-BY"/>
+        </w:rPr>
+      </w:pPr>
+    </w:p>
+    <w:p>
+      <w:pPr>
+        <w:widowControl/>
+        <w:tabs>
+          <w:tab w:val="right" w:pos="9344"/>
+        </w:tabs>
+        <w:spacing w:line="240" w:lineRule="auto"/>
+        <w:ind w:firstLine="0"/>
+        <w:rPr>
+          <w:lang w:val="ru-BY"/>
+        </w:rPr>
+      </w:pPr>
+    </w:p>
+    <w:p>
+      <w:pPr>
+        <w:widowControl/>
+        <w:tabs>
+          <w:tab w:val="right" w:pos="9344"/>
+        </w:tabs>
+        <w:spacing w:line="240" w:lineRule="auto"/>
+        <w:ind w:firstLine="708"/>
+        <w:jc w:val="left"/>
+        <w:rPr>
+          <w:lang w:val="ru-BY"/>
+        </w:rPr>
+      </w:pPr>
+      <w:r>
+        <w:rPr>
+          <w:lang w:val="ru-BY"/>
+        </w:rPr>
+        <w:t>Steamfolio</w:t>
+      </w:r>
+      <w:r>
+        <w:rPr>
+          <w:lang w:val="ru-BY"/>
+        </w:rPr>
+        <w:t xml:space="preserve"> </w:t>
+      </w:r>
+      <w:r>
+        <w:rPr>
+          <w:lang w:val="ru-BY"/>
+        </w:rPr>
+        <w:t>–</w:t>
+      </w:r>
+      <w:r>
+        <w:rPr>
+          <w:lang w:val="ru-BY"/>
+        </w:rPr>
+        <w:t xml:space="preserve"> </w:t>
+      </w:r>
+      <w:r>
+        <w:t>б</w:t>
+      </w:r>
+      <w:r>
+        <w:rPr>
+          <w:lang w:val="ru-BY"/>
+        </w:rPr>
+        <w:t xml:space="preserve">есплатный инструмент для инвесторов на рынке Steam. Позволяет вести портфолио предметов с автоматическим расчётом прибыли с учётом комиссии, отслеживать изменение цен за разные периоды и объёмы продаж. Достоинства: полная бесплатность, удобный интерфейс, специализация на Steam. Недостатки: только </w:t>
+      </w:r>
+      <w:r>
+        <w:t xml:space="preserve">базовые </w:t>
+      </w:r>
+      <w:r>
+        <w:rPr>
+          <w:lang w:val="ru-BY"/>
+        </w:rPr>
+        <w:t>Steam-предметы</w:t>
+      </w:r>
+      <w:r>
+        <w:rPr>
+          <w:lang w:val="ru-BY"/>
+        </w:rPr>
+        <w:t xml:space="preserve"> (Предметы из CS2)</w:t>
+      </w:r>
+      <w:r>
+        <w:rPr>
+          <w:lang w:val="ru-BY"/>
+        </w:rPr>
+        <w:t>, ограниченный набор аналитических инструментов.</w:t>
+      </w:r>
+    </w:p>
+    <w:p>
+      <w:pPr>
+        <w:widowControl/>
+        <w:tabs>
+          <w:tab w:val="right" w:pos="9344"/>
+        </w:tabs>
+        <w:spacing w:line="240" w:lineRule="auto"/>
+        <w:ind w:firstLine="708"/>
+        <w:jc w:val="left"/>
+        <w:rPr>
+          <w:lang w:val="ru-BY"/>
+        </w:rPr>
+      </w:pPr>
+      <w:r>
+        <w:rPr>
+          <w:lang w:val="ru-BY"/>
+        </w:rPr>
+        <w:lastRenderedPageBreak/>
+        <w:drawing>
+          <wp:inline distT="0" distB="0" distL="0" distR="0" wp14:anchorId="0605653C" wp14:editId="1D3AF13F">
+            <wp:extent cx="5410200" cy="2892496"/>
+            <wp:effectExtent l="0" t="0" r="0" b="3175"/>
+            <wp:docPr id="56440376" name="Picture 1"/>
+            <wp:cNvGraphicFramePr>
+              <a:graphicFrameLocks xmlns:a="http://schemas.openxmlformats.org/drawingml/2006/main" noChangeAspect="1"/>
+            </wp:cNvGraphicFramePr>
+            <a:graphic xmlns:a="http://schemas.openxmlformats.org/drawingml/2006/main">
+              <a:graphicData uri="http://schemas.openxmlformats.org/drawingml/2006/picture">
+                <pic:pic xmlns:pic="http://schemas.openxmlformats.org/drawingml/2006/picture">
+                  <pic:nvPicPr>
+                    <pic:cNvPr id="56440376" name=""/>
+                    <pic:cNvPicPr/>
+                  </pic:nvPicPr>
+                  <pic:blipFill>
+                    <a:blip r:embed="rId13"/>
+                    <a:stretch>
+                      <a:fillRect/>
+                    </a:stretch>
+                  </pic:blipFill>
+                  <pic:spPr>
+                    <a:xfrm>
+                      <a:off x="0" y="0"/>
+                      <a:ext cx="5410200" cy="2892496"/>
+                    </a:xfrm>
+                    <a:prstGeom prst="rect">
+                      <a:avLst/>
+                    </a:prstGeom>
+                  </pic:spPr>
+                </pic:pic>
+              </a:graphicData>
+            </a:graphic>
+          </wp:inline>
+        </w:drawing>
+      </w:r>
+    </w:p>
+    <w:p>
+      <w:pPr>
+        <w:widowControl/>
+        <w:tabs>
+          <w:tab w:val="right" w:pos="9344"/>
+        </w:tabs>
+        <w:spacing w:line="240" w:lineRule="auto"/>
+        <w:ind w:firstLine="708"/>
+        <w:jc w:val="left"/>
+        <w:rPr>
+          <w:lang w:val="ru-BY"/>
+        </w:rPr>
+      </w:pPr>
+    </w:p>
+    <w:p>
+      <w:pPr>
+        <w:widowControl/>
+        <w:tabs>
+          <w:tab w:val="right" w:pos="9344"/>
+        </w:tabs>
+        <w:spacing w:line="240" w:lineRule="auto"/>
+        <w:ind w:firstLine="708"/>
+        <w:jc w:val="center"/>
+        <w:rPr>
+          <w:lang w:val="ru-BY"/>
+        </w:rPr>
+      </w:pPr>
+      <w:r>
+        <w:rPr>
+          <w:lang w:val="ru-BY"/>
+        </w:rPr>
+        <w:t>Рисунок 1.5 – Раздел портфолио на Steamfolio</w:t>
       </w:r>
     </w:p>
     <w:p>
@@ -2123,7 +2982,6 @@
           <w:color w:val="000000"/>
           <w:sz w:val="28"/>
           <w:szCs w:val="28"/>
-          <w:lang w:val="en-US"/>
         </w:rPr>
         <w:t xml:space="preserve"> </w:t>
       </w:r>
@@ -2143,16 +3001,279 @@
     <w:p>
       <w:pPr>
         <w:rPr>
+          <w:lang w:val="en-US"/>
+        </w:rPr>
+      </w:pPr>
+    </w:p>
+    <w:p>
+      <w:pPr>
+        <w:widowControl/>
+        <w:tabs>
+          <w:tab w:val="right" w:pos="9344"/>
+        </w:tabs>
+        <w:spacing w:line="240" w:lineRule="auto"/>
+        <w:ind w:firstLine="708"/>
+        <w:jc w:val="left"/>
+        <w:rPr>
+          <w:lang w:val="ru-BY"/>
+        </w:rPr>
+      </w:pPr>
+      <w:r>
+        <w:rPr>
+          <w:lang w:val="ru-BY"/>
+        </w:rPr>
+        <w:t>Проведённый анализ аналогов показал, что ни один из существующих сервисов не предоставляет возможности одновременного учёта акций, криптовалют и предметов Steam в едином интерфейсе. Yahoo Finance и Delta хороши для акций и крипт</w:t>
+      </w:r>
+      <w:r>
+        <w:rPr>
+          <w:lang w:val="ru-BY"/>
+        </w:rPr>
+        <w:t>о</w:t>
+      </w:r>
+      <w:r>
+        <w:rPr>
+          <w:lang w:val="ru-BY"/>
+        </w:rPr>
+        <w:t>валют</w:t>
+      </w:r>
+      <w:r>
+        <w:rPr>
+          <w:lang w:val="ru-BY"/>
+        </w:rPr>
+        <w:t>, CoinMarketCap – только для криптовалют, Pricempire и Steamfolio – только для игровых предметов. Инвестору, работающему с разными классами активов, приходится использовать несколько приложений, что неудобно для целостного анализа.</w:t>
+      </w:r>
+    </w:p>
+    <w:p>
+      <w:pPr>
+        <w:widowControl/>
+        <w:tabs>
+          <w:tab w:val="right" w:pos="9344"/>
+        </w:tabs>
+        <w:spacing w:line="240" w:lineRule="auto"/>
+        <w:ind w:firstLine="708"/>
+        <w:jc w:val="left"/>
+        <w:rPr>
+          <w:lang w:val="ru-BY"/>
+        </w:rPr>
+      </w:pPr>
+      <w:r>
+        <w:rPr>
+          <w:lang w:val="ru-BY"/>
+        </w:rPr>
+        <w:t>Разрабатываемое веб-приложение должно объединить функциональность рассмотренных сервисов и предоставить пользователю единый инструмент для:</w:t>
+      </w:r>
+    </w:p>
+    <w:p>
+      <w:pPr>
+        <w:widowControl/>
+        <w:numPr>
+          <w:ilvl w:val="0"/>
+          <w:numId w:val="13"/>
+        </w:numPr>
+        <w:tabs>
+          <w:tab w:val="right" w:pos="9344"/>
+        </w:tabs>
+        <w:spacing w:line="240" w:lineRule="auto"/>
+        <w:jc w:val="left"/>
+        <w:rPr>
+          <w:lang w:val="ru-BY"/>
+        </w:rPr>
+      </w:pPr>
+      <w:r>
+        <w:rPr>
+          <w:lang w:val="ru-BY"/>
+        </w:rPr>
+        <w:t>добавления активов трёх типов (акции/ETF, криптовалюты, предметы Steam);</w:t>
+      </w:r>
+    </w:p>
+    <w:p>
+      <w:pPr>
+        <w:widowControl/>
+        <w:numPr>
+          <w:ilvl w:val="0"/>
+          <w:numId w:val="13"/>
+        </w:numPr>
+        <w:tabs>
+          <w:tab w:val="right" w:pos="9344"/>
+        </w:tabs>
+        <w:spacing w:line="240" w:lineRule="auto"/>
+        <w:jc w:val="left"/>
+        <w:rPr>
+          <w:lang w:val="ru-BY"/>
+        </w:rPr>
+      </w:pPr>
+      <w:r>
+        <w:rPr>
+          <w:lang w:val="ru-BY"/>
+        </w:rPr>
+        <w:t xml:space="preserve">автоматического получения актуальных цен через </w:t>
+      </w:r>
+      <w:r>
+        <w:rPr>
+          <w:lang w:val="ru-BY"/>
+        </w:rPr>
+        <w:t>единое API</w:t>
+      </w:r>
+      <w:r>
+        <w:rPr>
+          <w:lang w:val="ru-BY"/>
+        </w:rPr>
+        <w:t>;</w:t>
+      </w:r>
+    </w:p>
+    <w:p>
+      <w:pPr>
+        <w:widowControl/>
+        <w:numPr>
+          <w:ilvl w:val="0"/>
+          <w:numId w:val="13"/>
+        </w:numPr>
+        <w:tabs>
+          <w:tab w:val="right" w:pos="9344"/>
+        </w:tabs>
+        <w:spacing w:line="240" w:lineRule="auto"/>
+        <w:jc w:val="left"/>
+        <w:rPr>
+          <w:lang w:val="ru-BY"/>
+        </w:rPr>
+      </w:pPr>
+      <w:r>
+        <w:rPr>
+          <w:lang w:val="ru-BY"/>
+        </w:rPr>
+        <w:t>расчёта текущей стоимости портфеля и доходности по каждому активу;</w:t>
+      </w:r>
+    </w:p>
+    <w:p>
+      <w:pPr>
+        <w:widowControl/>
+        <w:numPr>
+          <w:ilvl w:val="0"/>
+          <w:numId w:val="13"/>
+        </w:numPr>
+        <w:tabs>
+          <w:tab w:val="right" w:pos="9344"/>
+        </w:tabs>
+        <w:spacing w:line="240" w:lineRule="auto"/>
+        <w:jc w:val="left"/>
+        <w:rPr>
+          <w:lang w:val="ru-BY"/>
+        </w:rPr>
+      </w:pPr>
+      <w:r>
+        <w:rPr>
+          <w:lang w:val="ru-BY"/>
+        </w:rPr>
+        <w:t>визуализации динамики портфеля с помощью графиков;</w:t>
+      </w:r>
+    </w:p>
+    <w:p>
+      <w:pPr>
+        <w:widowControl/>
+        <w:numPr>
+          <w:ilvl w:val="0"/>
+          <w:numId w:val="13"/>
+        </w:numPr>
+        <w:tabs>
+          <w:tab w:val="right" w:pos="9344"/>
+        </w:tabs>
+        <w:spacing w:line="240" w:lineRule="auto"/>
+        <w:jc w:val="left"/>
+        <w:rPr>
+          <w:lang w:val="ru-BY"/>
+        </w:rPr>
+      </w:pPr>
+      <w:r>
+        <w:rPr>
+          <w:lang w:val="ru-BY"/>
+        </w:rPr>
+        <w:t>ведения истории операций;</w:t>
+      </w:r>
+    </w:p>
+    <w:p>
+      <w:pPr>
+        <w:widowControl/>
+        <w:numPr>
+          <w:ilvl w:val="0"/>
+          <w:numId w:val="13"/>
+        </w:numPr>
+        <w:tabs>
+          <w:tab w:val="right" w:pos="9344"/>
+        </w:tabs>
+        <w:spacing w:line="240" w:lineRule="auto"/>
+        <w:jc w:val="left"/>
+        <w:rPr>
+          <w:lang w:val="ru-BY"/>
+        </w:rPr>
+      </w:pPr>
+      <w:r>
+        <w:rPr>
+          <w:lang w:val="ru-BY"/>
+        </w:rPr>
+        <w:t>настройки ценовых оповещений;</w:t>
+      </w:r>
+    </w:p>
+    <w:p>
+      <w:pPr>
+        <w:widowControl/>
+        <w:numPr>
+          <w:ilvl w:val="0"/>
+          <w:numId w:val="13"/>
+        </w:numPr>
+        <w:tabs>
+          <w:tab w:val="right" w:pos="9344"/>
+        </w:tabs>
+        <w:spacing w:line="240" w:lineRule="auto"/>
+        <w:jc w:val="left"/>
+        <w:rPr>
+          <w:lang w:val="ru-BY"/>
+        </w:rPr>
+      </w:pPr>
+      <w:r>
+        <w:rPr>
+          <w:lang w:val="ru-BY"/>
+        </w:rPr>
+        <w:t>безопасного хранения данных с аутентификацией.</w:t>
+      </w:r>
+    </w:p>
+    <w:p>
+      <w:pPr>
+        <w:widowControl/>
+        <w:tabs>
+          <w:tab w:val="right" w:pos="9344"/>
+        </w:tabs>
+        <w:spacing w:line="240" w:lineRule="auto"/>
+        <w:ind w:firstLine="708"/>
+        <w:jc w:val="left"/>
+        <w:rPr>
+          <w:lang w:val="ru-BY"/>
+        </w:rPr>
+      </w:pPr>
+      <w:r>
+        <w:rPr>
+          <w:lang w:val="ru-BY"/>
+        </w:rPr>
+        <w:t>Таким образом, приложение восполнит отсутствие на рынке единого решения для мультиактивного портфеля, включая специфический класс цифровых предметов из Steam.</w:t>
+      </w:r>
+    </w:p>
+    <w:p>
+      <w:pPr>
+        <w:rPr>
+          <w:lang w:val="ru-BY"/>
+        </w:rPr>
+      </w:pPr>
+    </w:p>
+    <w:p>
+      <w:pPr>
+        <w:rPr>
           <w:b/>
           <w:color w:val="000000"/>
-          <w:lang w:val="en-US"/>
         </w:rPr>
       </w:pPr>
       <w:r>
         <w:rPr>
           <w:b/>
           <w:color w:val="000000"/>
-          <w:lang w:val="en-US"/>
         </w:rPr>
         <w:br w:type="page"/>
       </w:r>
@@ -3942,6 +5063,155 @@
     </w:lvl>
   </w:abstractNum>
   <w:abstractNum w:abstractNumId="11" w15:restartNumberingAfterBreak="0">
+    <w:nsid w:val="7CB87182"/>
+    <w:multiLevelType w:val="multilevel"/>
+    <w:tmpl w:val="93ACD74A"/>
+    <w:lvl w:ilvl="0">
+      <w:start w:val="1"/>
+      <w:numFmt w:val="bullet"/>
+      <w:lvlText w:val=""/>
+      <w:lvlJc w:val="left"/>
+      <w:pPr>
+        <w:tabs>
+          <w:tab w:val="num" w:pos="720"/>
+        </w:tabs>
+        <w:ind w:left="720" w:hanging="360"/>
+      </w:pPr>
+      <w:rPr>
+        <w:rFonts w:ascii="Symbol" w:hAnsi="Symbol" w:hint="default"/>
+        <w:sz w:val="20"/>
+      </w:rPr>
+    </w:lvl>
+    <w:lvl w:ilvl="1" w:tentative="1">
+      <w:start w:val="1"/>
+      <w:numFmt w:val="bullet"/>
+      <w:lvlText w:val="o"/>
+      <w:lvlJc w:val="left"/>
+      <w:pPr>
+        <w:tabs>
+          <w:tab w:val="num" w:pos="1440"/>
+        </w:tabs>
+        <w:ind w:left="1440" w:hanging="360"/>
+      </w:pPr>
+      <w:rPr>
+        <w:rFonts w:ascii="Courier New" w:hAnsi="Courier New" w:hint="default"/>
+        <w:sz w:val="20"/>
+      </w:rPr>
+    </w:lvl>
+    <w:lvl w:ilvl="2" w:tentative="1">
+      <w:start w:val="1"/>
+      <w:numFmt w:val="bullet"/>
+      <w:lvlText w:val=""/>
+      <w:lvlJc w:val="left"/>
+      <w:pPr>
+        <w:tabs>
+          <w:tab w:val="num" w:pos="2160"/>
+        </w:tabs>
+        <w:ind w:left="2160" w:hanging="360"/>
+      </w:pPr>
+      <w:rPr>
+        <w:rFonts w:ascii="Wingdings" w:hAnsi="Wingdings" w:hint="default"/>
+        <w:sz w:val="20"/>
+      </w:rPr>
+    </w:lvl>
+    <w:lvl w:ilvl="3" w:tentative="1">
+      <w:start w:val="1"/>
+      <w:numFmt w:val="bullet"/>
+      <w:lvlText w:val=""/>
+      <w:lvlJc w:val="left"/>
+      <w:pPr>
+        <w:tabs>
+          <w:tab w:val="num" w:pos="2880"/>
+        </w:tabs>
+        <w:ind w:left="2880" w:hanging="360"/>
+      </w:pPr>
+      <w:rPr>
+        <w:rFonts w:ascii="Wingdings" w:hAnsi="Wingdings" w:hint="default"/>
+        <w:sz w:val="20"/>
+      </w:rPr>
+    </w:lvl>
+    <w:lvl w:ilvl="4" w:tentative="1">
+      <w:start w:val="1"/>
+      <w:numFmt w:val="bullet"/>
+      <w:lvlText w:val=""/>
+      <w:lvlJc w:val="left"/>
+      <w:pPr>
+        <w:tabs>
+          <w:tab w:val="num" w:pos="3600"/>
+        </w:tabs>
+        <w:ind w:left="3600" w:hanging="360"/>
+      </w:pPr>
+      <w:rPr>
+        <w:rFonts w:ascii="Wingdings" w:hAnsi="Wingdings" w:hint="default"/>
+        <w:sz w:val="20"/>
+      </w:rPr>
+    </w:lvl>
+    <w:lvl w:ilvl="5" w:tentative="1">
+      <w:start w:val="1"/>
+      <w:numFmt w:val="bullet"/>
+      <w:lvlText w:val=""/>
+      <w:lvlJc w:val="left"/>
+      <w:pPr>
+        <w:tabs>
+          <w:tab w:val="num" w:pos="4320"/>
+        </w:tabs>
+        <w:ind w:left="4320" w:hanging="360"/>
+      </w:pPr>
+      <w:rPr>
+        <w:rFonts w:ascii="Wingdings" w:hAnsi="Wingdings" w:hint="default"/>
+        <w:sz w:val="20"/>
+      </w:rPr>
+    </w:lvl>
+    <w:lvl w:ilvl="6" w:tentative="1">
+      <w:start w:val="1"/>
+      <w:numFmt w:val="bullet"/>
+      <w:lvlText w:val=""/>
+      <w:lvlJc w:val="left"/>
+      <w:pPr>
+        <w:tabs>
+          <w:tab w:val="num" w:pos="5040"/>
+        </w:tabs>
+        <w:ind w:left="5040" w:hanging="360"/>
+      </w:pPr>
+      <w:rPr>
+        <w:rFonts w:ascii="Wingdings" w:hAnsi="Wingdings" w:hint="default"/>
+        <w:sz w:val="20"/>
+      </w:rPr>
+    </w:lvl>
+    <w:lvl w:ilvl="7" w:tentative="1">
+      <w:start w:val="1"/>
+      <w:numFmt w:val="bullet"/>
+      <w:lvlText w:val=""/>
+      <w:lvlJc w:val="left"/>
+      <w:pPr>
+        <w:tabs>
+          <w:tab w:val="num" w:pos="5760"/>
+        </w:tabs>
+        <w:ind w:left="5760" w:hanging="360"/>
+      </w:pPr>
+      <w:rPr>
+        <w:rFonts w:ascii="Wingdings" w:hAnsi="Wingdings" w:hint="default"/>
+        <w:sz w:val="20"/>
+      </w:rPr>
+    </w:lvl>
+    <w:lvl w:ilvl="8" w:tentative="1">
+      <w:start w:val="1"/>
+      <w:numFmt w:val="bullet"/>
+      <w:lvlText w:val=""/>
+      <w:lvlJc w:val="left"/>
+      <w:pPr>
+        <w:tabs>
+          <w:tab w:val="num" w:pos="6480"/>
+        </w:tabs>
+        <w:ind w:left="6480" w:hanging="360"/>
+      </w:pPr>
+      <w:rPr>
+        <w:rFonts w:ascii="Wingdings" w:hAnsi="Wingdings" w:hint="default"/>
+        <w:sz w:val="20"/>
+      </w:rPr>
+    </w:lvl>
+  </w:abstractNum>
+  <w:abstractNum w:abstractNumId="12" w15:restartNumberingAfterBreak="0">
     <w:nsid w:val="7F583289"/>
     <w:multiLevelType w:val="hybridMultilevel"/>
     <w:tmpl w:val="791A78D8"/>
@@ -4049,7 +5319,7 @@
     <w:abstractNumId w:val="3"/>
   </w:num>
   <w:num w:numId="7" w16cid:durableId="986471693">
-    <w:abstractNumId w:val="11"/>
+    <w:abstractNumId w:val="12"/>
   </w:num>
   <w:num w:numId="8" w16cid:durableId="2134516426">
     <w:abstractNumId w:val="7"/>
@@ -4065,6 +5335,9 @@
   </w:num>
   <w:num w:numId="12" w16cid:durableId="1830780063">
     <w:abstractNumId w:val="1"/>
+  </w:num>
+  <w:num w:numId="13" w16cid:durableId="1651253017">
+    <w:abstractNumId w:val="11"/>
   </w:num>
 </w:numbering>
 </file>
@@ -4470,6 +5743,7 @@
   <w:style w:type="paragraph" w:default="1" w:styleId="Normal">
     <w:name w:val="Normal"/>
     <w:qFormat/>
+    <w:rsid w:val="008E73C0"/>
   </w:style>
   <w:style w:type="paragraph" w:styleId="Heading1">
     <w:name w:val="heading 1"/>
@@ -4593,7 +5867,6 @@
   <w:style w:type="character" w:default="1" w:styleId="DefaultParagraphFont">
     <w:name w:val="Default Paragraph Font"/>
     <w:uiPriority w:val="1"/>
-    <w:semiHidden/>
     <w:unhideWhenUsed/>
   </w:style>
   <w:style w:type="table" w:default="1" w:styleId="TableNormal">

</xml_diff>